<commit_message>
docs: add logo to the backlog document
</commit_message>
<xml_diff>
--- a/ms03-alerts-and-emergencies/Backlog_MS03_Alertas.docx
+++ b/ms03-alerts-and-emergencies/Backlog_MS03_Alertas.docx
@@ -4,7 +4,75 @@
   <w:body>
     <w:p>
       <w:pPr>
-        <w:spacing w:before="1400"/>
+        <w:spacing w:before="1400" w:after="0"/>
+        <w:jc w:val="center"/>
+        <w:rPr>
+          <w:b/>
+          <w:color w:val="1F497D" w:themeColor="text2"/>
+          <w:sz w:val="48"/>
+          <w:lang w:val="es-CO"/>
+        </w:rPr>
+      </w:pPr>
+      <w:r>
+        <w:rPr>
+          <w:b/>
+          <w:noProof/>
+          <w:color w:val="4F81BD" w:themeColor="accent1"/>
+          <w:sz w:val="48"/>
+          <w:lang w:val="es-CO"/>
+        </w:rPr>
+        <w:drawing>
+          <wp:inline distT="0" distB="0" distL="0" distR="0" wp14:anchorId="5854A9EF" wp14:editId="430810CA">
+            <wp:extent cx="1744980" cy="1754656"/>
+            <wp:effectExtent l="0" t="0" r="0" b="0"/>
+            <wp:docPr id="1326959875" name="Imagen 2"/>
+            <wp:cNvGraphicFramePr>
+              <a:graphicFrameLocks xmlns:a="http://schemas.openxmlformats.org/drawingml/2006/main" noChangeAspect="1"/>
+            </wp:cNvGraphicFramePr>
+            <a:graphic xmlns:a="http://schemas.openxmlformats.org/drawingml/2006/main">
+              <a:graphicData uri="http://schemas.openxmlformats.org/drawingml/2006/picture">
+                <pic:pic xmlns:pic="http://schemas.openxmlformats.org/drawingml/2006/picture">
+                  <pic:nvPicPr>
+                    <pic:cNvPr id="0" name="Picture 6"/>
+                    <pic:cNvPicPr>
+                      <a:picLocks noChangeAspect="1" noChangeArrowheads="1"/>
+                    </pic:cNvPicPr>
+                  </pic:nvPicPr>
+                  <pic:blipFill>
+                    <a:blip r:embed="rId8" cstate="print">
+                      <a:extLst>
+                        <a:ext uri="{28A0092B-C50C-407E-A947-70E740481C1C}">
+                          <a14:useLocalDpi xmlns:a14="http://schemas.microsoft.com/office/drawing/2010/main" val="0"/>
+                        </a:ext>
+                      </a:extLst>
+                    </a:blip>
+                    <a:srcRect/>
+                    <a:stretch>
+                      <a:fillRect/>
+                    </a:stretch>
+                  </pic:blipFill>
+                  <pic:spPr bwMode="auto">
+                    <a:xfrm>
+                      <a:off x="0" y="0"/>
+                      <a:ext cx="1750032" cy="1759736"/>
+                    </a:xfrm>
+                    <a:prstGeom prst="rect">
+                      <a:avLst/>
+                    </a:prstGeom>
+                    <a:noFill/>
+                    <a:ln>
+                      <a:noFill/>
+                    </a:ln>
+                  </pic:spPr>
+                </pic:pic>
+              </a:graphicData>
+            </a:graphic>
+          </wp:inline>
+        </w:drawing>
+      </w:r>
+    </w:p>
+    <w:p>
+      <w:pPr>
         <w:jc w:val="center"/>
         <w:rPr>
           <w:color w:val="1F497D" w:themeColor="text2"/>
@@ -840,11 +908,11 @@
           </w:tcPr>
           <w:p>
             <w:r>
-              <w:t xml:space="preserve">3. </w:t>
+              <w:t>3. V</w:t>
             </w:r>
             <w:proofErr w:type="spellStart"/>
             <w:r>
-              <w:t>Verificación</w:t>
+              <w:t>erificación</w:t>
             </w:r>
             <w:proofErr w:type="spellEnd"/>
           </w:p>
@@ -4619,21 +4687,7 @@
         <w:rPr>
           <w:lang w:val="es-CO"/>
         </w:rPr>
-        <w:t xml:space="preserve">Como equipo de desarrollo, quiero la base de datos creada con scripts SQL versionados sobre PostgreSQL en Docker, para que cualquier integrante </w:t>
-      </w:r>
-      <w:proofErr w:type="gramStart"/>
-      <w:r>
-        <w:rPr>
-          <w:lang w:val="es-CO"/>
-        </w:rPr>
-        <w:t>la levante igual</w:t>
-      </w:r>
-      <w:proofErr w:type="gramEnd"/>
-      <w:r>
-        <w:rPr>
-          <w:lang w:val="es-CO"/>
-        </w:rPr>
-        <w:t xml:space="preserve"> en su equipo.</w:t>
+        <w:t>Como equipo de desarrollo, quiero la base de datos creada con scripts SQL versionados sobre PostgreSQL en Docker, para que cualquier integrante la levante igual en su equipo.</w:t>
       </w:r>
     </w:p>
     <w:p>
@@ -8200,7 +8254,15 @@
       </w:r>
       <w:proofErr w:type="spellEnd"/>
       <w:r>
-        <w:t xml:space="preserve"> SpotBugs con find-sec-bugs al backend.</w:t>
+        <w:t xml:space="preserve"> </w:t>
+      </w:r>
+      <w:proofErr w:type="spellStart"/>
+      <w:r>
+        <w:t>SpotBugs</w:t>
+      </w:r>
+      <w:proofErr w:type="spellEnd"/>
+      <w:r>
+        <w:t xml:space="preserve"> con find-sec-bugs al backend.</w:t>
       </w:r>
     </w:p>
     <w:p>
@@ -9540,7 +9602,15 @@
       </w:r>
       <w:proofErr w:type="spellEnd"/>
       <w:r>
-        <w:t xml:space="preserve"> mientras envía.</w:t>
+        <w:t xml:space="preserve"> </w:t>
+      </w:r>
+      <w:proofErr w:type="spellStart"/>
+      <w:r>
+        <w:t>mientras</w:t>
+      </w:r>
+      <w:proofErr w:type="spellEnd"/>
+      <w:r>
+        <w:t xml:space="preserve"> envía.</w:t>
       </w:r>
     </w:p>
     <w:p>
@@ -9696,7 +9766,23 @@
       </w:r>
       <w:proofErr w:type="spellEnd"/>
       <w:r>
-        <w:t xml:space="preserve"> (Mockito, AssertJ; AlertRepository, CatalogClient, AuditService y Clock simulados): create_shouldSaveAlertInDraft, create_shouldSetManualOriginByDefault, create_shouldThrowInvalidReference_whenBuildingDoesNotExist, create_shouldThrowInvalidReference_whenRecipientDoesNotExist, create_shouldThrowExternalServiceUnavailable_whenMs02Fails, create_shouldRecordAuditEvent, create_shouldNotSave_whenValidationFails.</w:t>
+        <w:t xml:space="preserve"> (Mockito, </w:t>
+      </w:r>
+      <w:proofErr w:type="spellStart"/>
+      <w:r>
+        <w:t>AssertJ</w:t>
+      </w:r>
+      <w:proofErr w:type="spellEnd"/>
+      <w:r>
+        <w:t xml:space="preserve">; </w:t>
+      </w:r>
+      <w:proofErr w:type="spellStart"/>
+      <w:r>
+        <w:t>AlertRepository</w:t>
+      </w:r>
+      <w:proofErr w:type="spellEnd"/>
+      <w:r>
+        <w:t>, CatalogClient, AuditService y Clock simulados): create_shouldSaveAlertInDraft, create_shouldSetManualOriginByDefault, create_shouldThrowInvalidReference_whenBuildingDoesNotExist, create_shouldThrowInvalidReference_whenRecipientDoesNotExist, create_shouldThrowExternalServiceUnavailable_whenMs02Fails, create_shouldRecordAuditEvent, create_shouldNotSave_whenValidationFails.</w:t>
       </w:r>
     </w:p>
     <w:p>
@@ -10891,7 +10977,31 @@
       </w:r>
       <w:proofErr w:type="spellEnd"/>
       <w:r>
-        <w:t>: update_shouldUpdateOnlySentFields, update_shouldAllowDraftAndScheduled (parametrizado), update_shouldThrowInvalidState_whenActiveEndedOrArchived (parametrizado), update_shouldThrowNotFound, update_shouldRevalidateReferences_whenScopeChanges, update_shouldNotCallCatalog_whenOnlyInstructionsChange, update_shouldRecordAuditEvent.</w:t>
+        <w:t xml:space="preserve">: </w:t>
+      </w:r>
+      <w:proofErr w:type="spellStart"/>
+      <w:r>
+        <w:t>update_shouldUpdateOnlySentFields</w:t>
+      </w:r>
+      <w:proofErr w:type="spellEnd"/>
+      <w:r>
+        <w:t xml:space="preserve">, </w:t>
+      </w:r>
+      <w:proofErr w:type="spellStart"/>
+      <w:r>
+        <w:t>update_shouldAllowDraftAndScheduled</w:t>
+      </w:r>
+      <w:proofErr w:type="spellEnd"/>
+      <w:r>
+        <w:t xml:space="preserve"> (</w:t>
+      </w:r>
+      <w:proofErr w:type="spellStart"/>
+      <w:r>
+        <w:t>parametrizado</w:t>
+      </w:r>
+      <w:proofErr w:type="spellEnd"/>
+      <w:r>
+        <w:t>), update_shouldThrowInvalidState_whenActiveEndedOrArchived (parametrizado), update_shouldThrowNotFound, update_shouldRevalidateReferences_whenScopeChanges, update_shouldNotCallCatalog_whenOnlyInstructionsChange, update_shouldRecordAuditEvent.</w:t>
       </w:r>
     </w:p>
     <w:p>
@@ -10989,21 +11099,7 @@
         <w:rPr>
           <w:lang w:val="es-CO"/>
         </w:rPr>
-        <w:t xml:space="preserve">: redirige cuando el estado no es editable; muestra el banner del 409 de concurrencia con Recargar; </w:t>
-      </w:r>
-      <w:proofErr w:type="gramStart"/>
-      <w:r>
-        <w:rPr>
-          <w:lang w:val="es-CO"/>
-        </w:rPr>
-        <w:t>muestra no encontrado</w:t>
-      </w:r>
-      <w:proofErr w:type="gramEnd"/>
-      <w:r>
-        <w:rPr>
-          <w:lang w:val="es-CO"/>
-        </w:rPr>
-        <w:t xml:space="preserve"> ante un 404.</w:t>
+        <w:t>: redirige cuando el estado no es editable; muestra el banner del 409 de concurrencia con Recargar; muestra no encontrado ante un 404.</w:t>
       </w:r>
     </w:p>
     <w:p>
@@ -11030,21 +11126,7 @@
         <w:rPr>
           <w:lang w:val="es-CO"/>
         </w:rPr>
-        <w:t xml:space="preserve">Como coordinador de emergencia, quiero que </w:t>
-      </w:r>
-      <w:proofErr w:type="gramStart"/>
-      <w:r>
-        <w:rPr>
-          <w:lang w:val="es-CO"/>
-        </w:rPr>
-        <w:t>la alerta avance</w:t>
-      </w:r>
-      <w:proofErr w:type="gramEnd"/>
-      <w:r>
-        <w:rPr>
-          <w:lang w:val="es-CO"/>
-        </w:rPr>
-        <w:t xml:space="preserve"> por su ciclo de vida (programación, activación, finalización, archivado), para que su estado siempre refleje la situación real del evento.</w:t>
+        <w:t>Como coordinador de emergencia, quiero que la alerta avance por su ciclo de vida (programación, activación, finalización, archivado), para que su estado siempre refleje la situación real del evento.</w:t>
       </w:r>
     </w:p>
     <w:p>
@@ -11989,7 +12071,23 @@
       </w:r>
       <w:proofErr w:type="spellEnd"/>
       <w:r>
-        <w:t xml:space="preserve"> (Mockito): schedule_shouldChangeToScheduled, schedule_shouldThrowInvalidDate_whenPast, schedule_shouldThrowInvalidDate_whenEqualsNow, schedule_shouldThrowInvalidTransition_whenNotDraft, schedule_shouldThrowNotFound, schedule_shouldRecordAuditEvent.</w:t>
+        <w:t xml:space="preserve"> (Mockito): </w:t>
+      </w:r>
+      <w:proofErr w:type="spellStart"/>
+      <w:r>
+        <w:t>schedule_shouldChangeToScheduled</w:t>
+      </w:r>
+      <w:proofErr w:type="spellEnd"/>
+      <w:r>
+        <w:t xml:space="preserve">, </w:t>
+      </w:r>
+      <w:proofErr w:type="spellStart"/>
+      <w:r>
+        <w:t>schedule_shouldThrowInvalidDate_whenPast</w:t>
+      </w:r>
+      <w:proofErr w:type="spellEnd"/>
+      <w:r>
+        <w:t>, schedule_shouldThrowInvalidDate_whenEqualsNow, schedule_shouldThrowInvalidTransition_whenNotDraft, schedule_shouldThrowNotFound, schedule_shouldRecordAuditEvent.</w:t>
       </w:r>
     </w:p>
     <w:p>
@@ -13238,7 +13336,31 @@
       </w:r>
       <w:proofErr w:type="spellEnd"/>
       <w:r>
-        <w:t>: end_shouldChangeToEnded, end_shouldBeIdempotent_whenAlreadyEnded, end_shouldThrowInvalidTransition_whenDraftScheduledOrArchived, end_shouldThrowNotFound, end_shouldRecordAuditEvent.</w:t>
+        <w:t xml:space="preserve">: </w:t>
+      </w:r>
+      <w:proofErr w:type="spellStart"/>
+      <w:r>
+        <w:t>end_shouldChangeToEnded</w:t>
+      </w:r>
+      <w:proofErr w:type="spellEnd"/>
+      <w:r>
+        <w:t xml:space="preserve">, </w:t>
+      </w:r>
+      <w:proofErr w:type="spellStart"/>
+      <w:r>
+        <w:t>end_shouldBeIdempotent_whenAlreadyEnded</w:t>
+      </w:r>
+      <w:proofErr w:type="spellEnd"/>
+      <w:r>
+        <w:t xml:space="preserve">, </w:t>
+      </w:r>
+      <w:proofErr w:type="spellStart"/>
+      <w:r>
+        <w:t>end_shouldThrowInvalidTransition_whenDraftScheduledOrArchived</w:t>
+      </w:r>
+      <w:proofErr w:type="spellEnd"/>
+      <w:r>
+        <w:t>, end_shouldThrowNotFound, end_shouldRecordAuditEvent.</w:t>
       </w:r>
     </w:p>
     <w:p>
@@ -14039,21 +14161,7 @@
         <w:rPr>
           <w:lang w:val="es-CO"/>
         </w:rPr>
-        <w:t xml:space="preserve"> y </w:t>
-      </w:r>
-      <w:proofErr w:type="gramStart"/>
-      <w:r>
-        <w:rPr>
-          <w:lang w:val="es-CO"/>
-        </w:rPr>
-        <w:t>remitente definidos</w:t>
-      </w:r>
-      <w:proofErr w:type="gramEnd"/>
-      <w:r>
-        <w:rPr>
-          <w:lang w:val="es-CO"/>
-        </w:rPr>
-        <w:t xml:space="preserve"> (o destinatarios de demo definidos si el dominio no está verificado).</w:t>
+        <w:t xml:space="preserve"> y remitente definidos (o destinatarios de demo definidos si el dominio no está verificado).</w:t>
       </w:r>
     </w:p>
     <w:p>
@@ -14690,7 +14798,23 @@
       </w:r>
       <w:proofErr w:type="spellEnd"/>
       <w:r>
-        <w:t xml:space="preserve"> (Mockito; EmailSender, RecipientResolverService, repository simulados): notify_shouldSendOneEmailPerUniqueRecipient, notify_shouldRecordSentForEach, notify_shouldRecordFailedAndContinue_whenOneSendFails, notify_shouldNotResend_whenDeliveryAlreadyExists, notify_shouldNotChangeAlertState_onFailure, notify_shouldRecordAudit_whenResolverFails.</w:t>
+        <w:t xml:space="preserve"> (Mockito; </w:t>
+      </w:r>
+      <w:proofErr w:type="spellStart"/>
+      <w:r>
+        <w:t>EmailSender</w:t>
+      </w:r>
+      <w:proofErr w:type="spellEnd"/>
+      <w:r>
+        <w:t xml:space="preserve">, </w:t>
+      </w:r>
+      <w:proofErr w:type="spellStart"/>
+      <w:r>
+        <w:t>RecipientResolverService</w:t>
+      </w:r>
+      <w:proofErr w:type="spellEnd"/>
+      <w:r>
+        <w:t>, repository simulados): notify_shouldSendOneEmailPerUniqueRecipient, notify_shouldRecordSentForEach, notify_shouldRecordFailedAndContinue_whenOneSendFails, notify_shouldNotResend_whenDeliveryAlreadyExists, notify_shouldNotChangeAlertState_onFailure, notify_shouldRecordAudit_whenResolverFails.</w:t>
       </w:r>
     </w:p>
     <w:p>
@@ -15616,7 +15740,31 @@
       </w:r>
       <w:proofErr w:type="spellEnd"/>
       <w:r>
-        <w:t xml:space="preserve">: confirm_shouldCreateConfirmation, confirm_shouldReturnExisting_whenAlreadyConfirmed, confirm_shouldThrowNotActive, confirm_shouldThrowNotARecipient, confirm_shouldThrowNotFound, confirm_shouldReturnExisting_whenConcurrentInsertFails. </w:t>
+        <w:t xml:space="preserve">: </w:t>
+      </w:r>
+      <w:proofErr w:type="spellStart"/>
+      <w:r>
+        <w:t>confirm_shouldCreateConfirmation</w:t>
+      </w:r>
+      <w:proofErr w:type="spellEnd"/>
+      <w:r>
+        <w:t xml:space="preserve">, </w:t>
+      </w:r>
+      <w:proofErr w:type="spellStart"/>
+      <w:r>
+        <w:t>confirm_shouldReturnExisting_whenAlreadyConfirmed</w:t>
+      </w:r>
+      <w:proofErr w:type="spellEnd"/>
+      <w:r>
+        <w:t xml:space="preserve">, </w:t>
+      </w:r>
+      <w:proofErr w:type="spellStart"/>
+      <w:r>
+        <w:t>confirm_shouldThrowNotActive</w:t>
+      </w:r>
+      <w:proofErr w:type="spellEnd"/>
+      <w:r>
+        <w:t xml:space="preserve">, confirm_shouldThrowNotARecipient, confirm_shouldThrowNotFound, confirm_shouldReturnExisting_whenConcurrentInsertFails. </w:t>
       </w:r>
       <w:proofErr w:type="spellStart"/>
       <w:r>
@@ -15728,21 +15876,7 @@
         <w:rPr>
           <w:lang w:val="es-CO"/>
         </w:rPr>
-        <w:t xml:space="preserve">: muestra las instrucciones como texto escapado; confirma y refleja el resultado; </w:t>
-      </w:r>
-      <w:proofErr w:type="gramStart"/>
-      <w:r>
-        <w:rPr>
-          <w:lang w:val="es-CO"/>
-        </w:rPr>
-        <w:t>estado ya confirmada</w:t>
-      </w:r>
-      <w:proofErr w:type="gramEnd"/>
-      <w:r>
-        <w:rPr>
-          <w:lang w:val="es-CO"/>
-        </w:rPr>
-        <w:t>; alerta no vigente; 403; 404; redirección al login sin sesión.</w:t>
+        <w:t>: muestra las instrucciones como texto escapado; confirma y refleja el resultado; estado ya confirmada; alerta no vigente; 403; 404; redirección al login sin sesión.</w:t>
       </w:r>
     </w:p>
     <w:p>
@@ -16325,7 +16459,31 @@
       </w:r>
       <w:proofErr w:type="spellEnd"/>
       <w:r>
-        <w:t>: create_withSimulationOrigin_shouldAssociateSimulationId, create_withFutureActivation_shouldBeScheduled, create_withoutActivation_shouldBeDraft, create_withPastActivation_shouldThrowInvalidDate, create_shouldRecordServiceAsActor.</w:t>
+        <w:t xml:space="preserve">: </w:t>
+      </w:r>
+      <w:proofErr w:type="spellStart"/>
+      <w:r>
+        <w:t>create_withSimulationOrigin_shouldAssociateSimulationId</w:t>
+      </w:r>
+      <w:proofErr w:type="spellEnd"/>
+      <w:r>
+        <w:t xml:space="preserve">, </w:t>
+      </w:r>
+      <w:proofErr w:type="spellStart"/>
+      <w:r>
+        <w:t>create_withFutureActivation_shouldBeScheduled</w:t>
+      </w:r>
+      <w:proofErr w:type="spellEnd"/>
+      <w:r>
+        <w:t xml:space="preserve">, </w:t>
+      </w:r>
+      <w:proofErr w:type="spellStart"/>
+      <w:r>
+        <w:t>create_withoutActivation_shouldBeDraft</w:t>
+      </w:r>
+      <w:proofErr w:type="spellEnd"/>
+      <w:r>
+        <w:t>, create_withPastActivation_shouldThrowInvalidDate, create_shouldRecordServiceAsActor.</w:t>
       </w:r>
     </w:p>
     <w:p>
@@ -16790,7 +16948,31 @@
       </w:r>
       <w:proofErr w:type="spellEnd"/>
       <w:r>
-        <w:t>: endBySimulation_shouldChangeToEnded, endBySimulation_shouldBeIdempotent, endBySimulation_shouldThrowMismatch, endBySimulation_shouldThrowNotFound, endBySimulation_shouldRecordServiceAsActor.</w:t>
+        <w:t xml:space="preserve">: </w:t>
+      </w:r>
+      <w:proofErr w:type="spellStart"/>
+      <w:r>
+        <w:t>endBySimulation_shouldChangeToEnded</w:t>
+      </w:r>
+      <w:proofErr w:type="spellEnd"/>
+      <w:r>
+        <w:t xml:space="preserve">, </w:t>
+      </w:r>
+      <w:proofErr w:type="spellStart"/>
+      <w:r>
+        <w:t>endBySimulation_shouldBeIdempotent</w:t>
+      </w:r>
+      <w:proofErr w:type="spellEnd"/>
+      <w:r>
+        <w:t xml:space="preserve">, </w:t>
+      </w:r>
+      <w:proofErr w:type="spellStart"/>
+      <w:r>
+        <w:t>endBySimulation_shouldThrowMismatch</w:t>
+      </w:r>
+      <w:proofErr w:type="spellEnd"/>
+      <w:r>
+        <w:t>, endBySimulation_shouldThrowNotFound, endBySimulation_shouldRecordServiceAsActor.</w:t>
       </w:r>
     </w:p>
     <w:p>
@@ -17491,7 +17673,31 @@
       </w:r>
       <w:proofErr w:type="spellEnd"/>
       <w:r>
-        <w:t>: findById_shouldReturnFullAlert, findById_shouldThrowNotFound, findById_shouldThrowNotARecipient_whenUserNotRecipient.</w:t>
+        <w:t xml:space="preserve">: </w:t>
+      </w:r>
+      <w:proofErr w:type="spellStart"/>
+      <w:r>
+        <w:t>findById_shouldReturnFullAlert</w:t>
+      </w:r>
+      <w:proofErr w:type="spellEnd"/>
+      <w:r>
+        <w:t xml:space="preserve">, </w:t>
+      </w:r>
+      <w:proofErr w:type="spellStart"/>
+      <w:r>
+        <w:t>findById_shouldThrowNotFound</w:t>
+      </w:r>
+      <w:proofErr w:type="spellEnd"/>
+      <w:r>
+        <w:t xml:space="preserve">, </w:t>
+      </w:r>
+      <w:proofErr w:type="spellStart"/>
+      <w:r>
+        <w:t>findById_shouldThrowNotARecipient_whenUserNotRecipient</w:t>
+      </w:r>
+      <w:proofErr w:type="spellEnd"/>
+      <w:r>
+        <w:t>.</w:t>
       </w:r>
     </w:p>
     <w:p>
@@ -18496,7 +18702,31 @@
       </w:r>
       <w:proofErr w:type="spellEnd"/>
       <w:r>
-        <w:t>: search_shouldFilterByState, search_shouldFilterByDateRange, search_shouldReturnAllWhenNoFilters, search_shouldThrowInvalidPagination_whenSizeExceedsMax, search_shouldThrowValidation_whenStartAfterEnd.</w:t>
+        <w:t xml:space="preserve">: </w:t>
+      </w:r>
+      <w:proofErr w:type="spellStart"/>
+      <w:r>
+        <w:t>search_shouldFilterByState</w:t>
+      </w:r>
+      <w:proofErr w:type="spellEnd"/>
+      <w:r>
+        <w:t xml:space="preserve">, </w:t>
+      </w:r>
+      <w:proofErr w:type="spellStart"/>
+      <w:r>
+        <w:t>search_shouldFilterByDateRange</w:t>
+      </w:r>
+      <w:proofErr w:type="spellEnd"/>
+      <w:r>
+        <w:t xml:space="preserve">, </w:t>
+      </w:r>
+      <w:proofErr w:type="spellStart"/>
+      <w:r>
+        <w:t>search_shouldReturnAllWhenNoFilters</w:t>
+      </w:r>
+      <w:proofErr w:type="spellEnd"/>
+      <w:r>
+        <w:t>, search_shouldThrowInvalidPagination_whenSizeExceedsMax, search_shouldThrowValidation_whenStartAfterEnd.</w:t>
       </w:r>
     </w:p>
     <w:p>
@@ -19854,7 +20084,31 @@
       </w:r>
       <w:proofErr w:type="spellEnd"/>
       <w:r>
-        <w:t>: findByAlert_shouldReturnOrderedEvents, findByAlert_shouldReturnEmptyList, findByAlert_shouldThrowNotFound.</w:t>
+        <w:t xml:space="preserve">: </w:t>
+      </w:r>
+      <w:proofErr w:type="spellStart"/>
+      <w:r>
+        <w:t>findByAlert_shouldReturnOrderedEvents</w:t>
+      </w:r>
+      <w:proofErr w:type="spellEnd"/>
+      <w:r>
+        <w:t xml:space="preserve">, </w:t>
+      </w:r>
+      <w:proofErr w:type="spellStart"/>
+      <w:r>
+        <w:t>findByAlert_shouldReturnEmptyList</w:t>
+      </w:r>
+      <w:proofErr w:type="spellEnd"/>
+      <w:r>
+        <w:t xml:space="preserve">, </w:t>
+      </w:r>
+      <w:proofErr w:type="spellStart"/>
+      <w:r>
+        <w:t>findByAlert_shouldThrowNotFound</w:t>
+      </w:r>
+      <w:proofErr w:type="spellEnd"/>
+      <w:r>
+        <w:t>.</w:t>
       </w:r>
     </w:p>
     <w:p>
@@ -21369,8 +21623,8 @@
       </w:pPr>
     </w:p>
     <w:sectPr>
-      <w:headerReference w:type="default" r:id="rId8"/>
-      <w:footerReference w:type="default" r:id="rId9"/>
+      <w:headerReference w:type="default" r:id="rId9"/>
+      <w:footerReference w:type="default" r:id="rId10"/>
       <w:pgSz w:w="12240" w:h="15840"/>
       <w:pgMar w:top="1080" w:right="1224" w:bottom="1080" w:left="1224" w:header="720" w:footer="720" w:gutter="0"/>
       <w:cols w:space="720"/>

</xml_diff>